<commit_message>
Second pass on Mila's Lesson 1: link to last lesson, less prose, cleaner diagrams
Explicitly acknowledges what was covered last time (organs, a first
look at blood vessels) instead of pretending a fresh start, adds real
new heart depth (the heart's two sides, a set of "did you know" facts)
as the centerpiece of this lesson before circling back to blood
vessels, redraws both SVG diagrams (a cleaner ribcage/heart close-up,
an icon-labelled heart/lungs/body loop), and converts most paragraph
cards into short bulleted/two-column visuals. Also removed em dashes
throughout this lesson's content and worksheet, and a shared quiz
feedback string in the kit itself.

Co-Authored-By: Claude Sonnet 5 <noreply@anthropic.com>
Claude-Session: https://claude.ai/code/session_01D9BkbuTBSsLezVQzB1nDhU
</commit_message>
<xml_diff>
--- a/courses/mila-science/lessons/lesson-01-circulatory-system/worksheet.docx
+++ b/courses/mila-science/lessons/lesson-01-circulatory-system/worksheet.docx
@@ -12,7 +12,7 @@
           <w:b/>
           <w:bCs/>
         </w:rPr>
-        <w:t xml:space="preserve">Lesson 1 Worksheet — The Circulatory System</w:t>
+        <w:t xml:space="preserve">Lesson 1 Worksheet: The Circulatory System</w:t>
       </w:r>
     </w:p>
     <w:p>
@@ -804,7 +804,7 @@
           <w:bCs/>
           <w:color w:val="F0663B"/>
         </w:rPr>
-        <w:t xml:space="preserve">Answer key (tutor copy — not for Mila)</w:t>
+        <w:t xml:space="preserve">Answer key (tutor copy, not for Mila)</w:t>
       </w:r>
     </w:p>
     <w:p>
@@ -968,7 +968,7 @@
         <w:t xml:space="preserve">3b.</w:t>
       </w:r>
       <w:r>
-        <w:t xml:space="preserve"> Blood carries away waste, such as carbon dioxide. It needs to get rid of it because it's a waste gas the body doesn't need — the lungs and kidneys are the organs that help get rid of it.</w:t>
+        <w:t xml:space="preserve"> Blood carries away waste, such as carbon dioxide. It needs to get rid of it because it's a waste gas the body doesn't need, and the lungs and kidneys are the organs that help get rid of it.</w:t>
       </w:r>
     </w:p>
     <w:p>
@@ -1000,7 +1000,7 @@
         <w:t xml:space="preserve">5a.</w:t>
       </w:r>
       <w:r>
-        <w:t xml:space="preserve"> B — circulation. </w:t>
+        <w:t xml:space="preserve"> B: circulation. </w:t>
       </w:r>
       <w:r>
         <w:rPr>
@@ -1010,7 +1010,7 @@
         <w:t xml:space="preserve">5b.</w:t>
       </w:r>
       <w:r>
-        <w:t xml:space="preserve"> C — the heart, blood vessels, and blood. </w:t>
+        <w:t xml:space="preserve"> C: the heart, blood vessels, and blood. </w:t>
       </w:r>
       <w:r>
         <w:rPr>
@@ -1020,7 +1020,7 @@
         <w:t xml:space="preserve">5c.</w:t>
       </w:r>
       <w:r>
-        <w:t xml:space="preserve"> C — capillaries (their thin walls let oxygen and food pass through to cells, and waste pass back). </w:t>
+        <w:t xml:space="preserve"> C: capillaries (their thin walls let oxygen and food pass through to cells, and waste pass back). </w:t>
       </w:r>
       <w:r>
         <w:rPr>
@@ -1030,7 +1030,7 @@
         <w:t xml:space="preserve">5d.</w:t>
       </w:r>
       <w:r>
-        <w:t xml:space="preserve"> B — the brain.</w:t>
+        <w:t xml:space="preserve"> B: the brain.</w:t>
       </w:r>
     </w:p>
     <w:p>
@@ -1062,7 +1062,7 @@
         <w:t xml:space="preserve">6b.</w:t>
       </w:r>
       <w:r>
-        <w:t xml:space="preserve"> Sitting still, at 78 bpm — her body wasn't working hard, so her muscles didn't need much extra oxygen delivered.</w:t>
+        <w:t xml:space="preserve"> Sitting still, at 78 bpm: her body wasn't working hard, so her muscles didn't need much extra oxygen delivered.</w:t>
       </w:r>
     </w:p>
     <w:p>
@@ -1078,7 +1078,7 @@
         <w:t xml:space="preserve">6c.</w:t>
       </w:r>
       <w:r>
-        <w:t xml:space="preserve"> Dancing, at 130 bpm — likely her most physically demanding activity in this set.</w:t>
+        <w:t xml:space="preserve"> Dancing, at 130 bpm: likely her most physically demanding activity in this set.</w:t>
       </w:r>
     </w:p>
     <w:p>

</xml_diff>